<commit_message>
Add UX: Core MVP user flow definition doc
</commit_message>
<xml_diff>
--- a/documents/team-b/UX/Core-MVP-User-Flow-Definition.docx
+++ b/documents/team-b/UX/Core-MVP-User-Flow-Definition.docx
@@ -87,6 +87,12 @@
           <w:rFonts w:ascii="Calibri" w:eastAsia="Calibri" w:hAnsi="Calibri" w:cs="Calibri"/>
         </w:rPr>
         <w:t>Faridullah Jabbar Khil</w:t>
+      </w:r>
+      <w:r>
+        <w:rPr>
+          <w:rFonts w:ascii="Calibri" w:eastAsia="Calibri" w:hAnsi="Calibri" w:cs="Calibri"/>
+        </w:rPr>
+        <w:t xml:space="preserve"> S4020393</w:t>
       </w:r>
     </w:p>
     <w:p>
@@ -532,6 +538,9 @@
         <w:jc w:val="center"/>
       </w:pPr>
       <w:r>
+        <w:rPr>
+          <w:noProof/>
+        </w:rPr>
         <w:drawing>
           <wp:inline distT="0" distB="0" distL="0" distR="0" wp14:anchorId="17393243" wp14:editId="15D066D7">
             <wp:extent cx="5943600" cy="3994785"/>
@@ -575,11 +584,14 @@
         <w:jc w:val="center"/>
       </w:pPr>
       <w:r>
+        <w:rPr>
+          <w:noProof/>
+        </w:rPr>
         <w:lastRenderedPageBreak/>
         <w:drawing>
-          <wp:inline distT="0" distB="0" distL="0" distR="0" wp14:anchorId="483E60EA" wp14:editId="16CB919B">
-            <wp:extent cx="5943600" cy="2562860"/>
-            <wp:effectExtent l="0" t="0" r="0" b="8890"/>
+          <wp:inline distT="0" distB="0" distL="0" distR="0" wp14:anchorId="483E60EA" wp14:editId="099CB1CA">
+            <wp:extent cx="5887068" cy="2538484"/>
+            <wp:effectExtent l="0" t="0" r="0" b="0"/>
             <wp:docPr id="1486960271" name="Picture 1"/>
             <wp:cNvGraphicFramePr>
               <a:graphicFrameLocks xmlns:a="http://schemas.openxmlformats.org/drawingml/2006/main" noChangeAspect="1"/>
@@ -600,7 +612,7 @@
                   <pic:spPr>
                     <a:xfrm>
                       <a:off x="0" y="0"/>
-                      <a:ext cx="5943600" cy="2562860"/>
+                      <a:ext cx="5916273" cy="2551077"/>
                     </a:xfrm>
                     <a:prstGeom prst="rect">
                       <a:avLst/>
@@ -619,6 +631,9 @@
         <w:jc w:val="center"/>
       </w:pPr>
       <w:r>
+        <w:rPr>
+          <w:noProof/>
+        </w:rPr>
         <w:drawing>
           <wp:inline distT="0" distB="0" distL="0" distR="0" wp14:anchorId="64B3ABFC" wp14:editId="0E9F6B29">
             <wp:extent cx="5943600" cy="2865120"/>
@@ -662,6 +677,9 @@
         <w:jc w:val="center"/>
       </w:pPr>
       <w:r>
+        <w:rPr>
+          <w:noProof/>
+        </w:rPr>
         <w:lastRenderedPageBreak/>
         <w:drawing>
           <wp:inline distT="0" distB="0" distL="0" distR="0" wp14:anchorId="0107CF41" wp14:editId="5AB70B16">
@@ -706,6 +724,9 @@
         <w:jc w:val="center"/>
       </w:pPr>
       <w:r>
+        <w:rPr>
+          <w:noProof/>
+        </w:rPr>
         <w:drawing>
           <wp:inline distT="0" distB="0" distL="0" distR="0" wp14:anchorId="1821ACE0" wp14:editId="630B4610">
             <wp:extent cx="5943600" cy="2757170"/>
@@ -749,6 +770,9 @@
         <w:jc w:val="center"/>
       </w:pPr>
       <w:r>
+        <w:rPr>
+          <w:noProof/>
+        </w:rPr>
         <w:lastRenderedPageBreak/>
         <w:drawing>
           <wp:inline distT="0" distB="0" distL="0" distR="0" wp14:anchorId="6619F9F3" wp14:editId="55E40E9C">
@@ -814,6 +838,9 @@
         <w:jc w:val="center"/>
       </w:pPr>
       <w:r>
+        <w:rPr>
+          <w:noProof/>
+        </w:rPr>
         <w:drawing>
           <wp:inline distT="0" distB="0" distL="0" distR="0" wp14:anchorId="70AD8F5F" wp14:editId="1269F0A4">
             <wp:extent cx="5943600" cy="1600835"/>

</xml_diff>

<commit_message>
Add UX: Core MVP  user flow definition docs
</commit_message>
<xml_diff>
--- a/documents/team-b/UX/Core-MVP-User-Flow-Definition.docx
+++ b/documents/team-b/UX/Core-MVP-User-Flow-Definition.docx
@@ -92,7 +92,25 @@
         <w:rPr>
           <w:rFonts w:ascii="Calibri" w:eastAsia="Calibri" w:hAnsi="Calibri" w:cs="Calibri"/>
         </w:rPr>
-        <w:t xml:space="preserve"> S4020393</w:t>
+        <w:t xml:space="preserve"> </w:t>
+      </w:r>
+      <w:r>
+        <w:rPr>
+          <w:rFonts w:ascii="Calibri" w:eastAsia="Calibri" w:hAnsi="Calibri" w:cs="Calibri"/>
+        </w:rPr>
+        <w:t>(</w:t>
+      </w:r>
+      <w:r>
+        <w:rPr>
+          <w:rFonts w:ascii="Calibri" w:eastAsia="Calibri" w:hAnsi="Calibri" w:cs="Calibri"/>
+        </w:rPr>
+        <w:t>S4020393</w:t>
+      </w:r>
+      <w:r>
+        <w:rPr>
+          <w:rFonts w:ascii="Calibri" w:eastAsia="Calibri" w:hAnsi="Calibri" w:cs="Calibri"/>
+        </w:rPr>
+        <w:t>)</w:t>
       </w:r>
     </w:p>
     <w:p>
@@ -538,14 +556,11 @@
         <w:jc w:val="center"/>
       </w:pPr>
       <w:r>
-        <w:rPr>
-          <w:noProof/>
-        </w:rPr>
         <w:drawing>
-          <wp:inline distT="0" distB="0" distL="0" distR="0" wp14:anchorId="17393243" wp14:editId="15D066D7">
-            <wp:extent cx="5943600" cy="3994785"/>
-            <wp:effectExtent l="0" t="0" r="0" b="5715"/>
-            <wp:docPr id="1068031952" name="Picture 1"/>
+          <wp:inline distT="0" distB="0" distL="0" distR="0" wp14:anchorId="5400912A" wp14:editId="49776E34">
+            <wp:extent cx="5943600" cy="3895090"/>
+            <wp:effectExtent l="0" t="0" r="0" b="0"/>
+            <wp:docPr id="1246986442" name="Picture 1"/>
             <wp:cNvGraphicFramePr>
               <a:graphicFrameLocks xmlns:a="http://schemas.openxmlformats.org/drawingml/2006/main" noChangeAspect="1"/>
             </wp:cNvGraphicFramePr>
@@ -553,7 +568,7 @@
               <a:graphicData uri="http://schemas.openxmlformats.org/drawingml/2006/picture">
                 <pic:pic xmlns:pic="http://schemas.openxmlformats.org/drawingml/2006/picture">
                   <pic:nvPicPr>
-                    <pic:cNvPr id="1068031952" name=""/>
+                    <pic:cNvPr id="1246986442" name=""/>
                     <pic:cNvPicPr/>
                   </pic:nvPicPr>
                   <pic:blipFill>
@@ -565,7 +580,7 @@
                   <pic:spPr>
                     <a:xfrm>
                       <a:off x="0" y="0"/>
-                      <a:ext cx="5943600" cy="3994785"/>
+                      <a:ext cx="5943600" cy="3895090"/>
                     </a:xfrm>
                     <a:prstGeom prst="rect">
                       <a:avLst/>

</xml_diff>